<commit_message>
fix(gravedad-comercio-bilateral-peru): quitar referencia al repo privado del anexo (version BCRP)
</commit_message>
<xml_diff>
--- a/investigaciones/gravedad-comercio-bilateral-peru/paper/Paper-BCRP-Estudios-Economicos.docx
+++ b/investigaciones/gravedad-comercio-bilateral-peru/paper/Paper-BCRP-Estudios-Economicos.docx
@@ -5934,7 +5934,7 @@
         <w:pStyle w:val="Body"/>
       </w:pPr>
       <w:r>
-        <w:t>Todo el código, los datos extraídos y el notebook ejecutado están en</w:t>
+        <w:t>El código de extracción, los paneles de datos (crudos y procesados), el</w:t>
       </w:r>
     </w:p>
     <w:p>
@@ -5942,16 +5942,15 @@
         <w:pStyle w:val="Body"/>
       </w:pPr>
       <w:r>
-        <w:t>investigaciones/gravedad-comercio-bilateral-peru/ del repositorio:</w:t>
+        <w:t>script de estimación y el notebook ejecutado con los seis resultados</w:t>
       </w:r>
     </w:p>
     <w:p>
       <w:pPr>
-        <w:pStyle w:val="Bullet"/>
-        <w:ind w:left="480" w:hanging="280"/>
+        <w:pStyle w:val="Body"/>
       </w:pPr>
       <w:r>
-        <w:t>-  data/raw/panel_bilateral_peru_2015_2024.json — extracción cruda de</w:t>
+        <w:t>completos (tres especificaciones para exportaciones, tres para</w:t>
       </w:r>
     </w:p>
     <w:p>
@@ -5959,108 +5958,7 @@
         <w:pStyle w:val="Body"/>
       </w:pPr>
       <w:r>
-        <w:t>exportaciones, desde Neon.</w:t>
-      </w:r>
-    </w:p>
-    <w:p>
-      <w:pPr>
-        <w:pStyle w:val="Bullet"/>
-        <w:ind w:left="480" w:hanging="280"/>
-      </w:pPr>
-      <w:r>
-        <w:t>-  data/raw/panel_bilateral_peru_importaciones_2015_2024.json — extracción</w:t>
-      </w:r>
-    </w:p>
-    <w:p>
-      <w:pPr>
-        <w:pStyle w:val="Body"/>
-      </w:pPr>
-      <w:r>
-        <w:t>cruda de importaciones.</w:t>
-      </w:r>
-    </w:p>
-    <w:p>
-      <w:pPr>
-        <w:pStyle w:val="Bullet"/>
-        <w:ind w:left="480" w:hanging="280"/>
-      </w:pPr>
-      <w:r>
-        <w:t>-  data/procesado/panel_final_estimacion_exportaciones.csv y</w:t>
-      </w:r>
-    </w:p>
-    <w:p>
-      <w:pPr>
-        <w:pStyle w:val="Body"/>
-      </w:pPr>
-      <w:r>
-        <w:t>_importaciones.csv — paneles finales de cada especificación 3 (1,847</w:t>
-      </w:r>
-    </w:p>
-    <w:p>
-      <w:pPr>
-        <w:pStyle w:val="Body"/>
-      </w:pPr>
-      <w:r>
-        <w:t>filas cada uno).</w:t>
-      </w:r>
-    </w:p>
-    <w:p>
-      <w:pPr>
-        <w:pStyle w:val="Bullet"/>
-        <w:ind w:left="480" w:hanging="280"/>
-      </w:pPr>
-      <w:r>
-        <w:t>-  data/procesado/tabla_comparativa_especificaciones.csv — las seis</w:t>
-      </w:r>
-    </w:p>
-    <w:p>
-      <w:pPr>
-        <w:pStyle w:val="Body"/>
-      </w:pPr>
-      <w:r>
-        <w:t>especificaciones (3 exporta + 3 importa) con todos los coeficientes.</w:t>
-      </w:r>
-    </w:p>
-    <w:p>
-      <w:pPr>
-        <w:pStyle w:val="Bullet"/>
-        <w:ind w:left="480" w:hanging="280"/>
-      </w:pPr>
-      <w:r>
-        <w:t>-  scripts/estimar_gravedad.py — script que reproduce las seis</w:t>
-      </w:r>
-    </w:p>
-    <w:p>
-      <w:pPr>
-        <w:pStyle w:val="Body"/>
-      </w:pPr>
-      <w:r>
-        <w:t>especificaciones de punta a punta.</w:t>
-      </w:r>
-    </w:p>
-    <w:p>
-      <w:pPr>
-        <w:pStyle w:val="Bullet"/>
-        <w:ind w:left="480" w:hanging="280"/>
-      </w:pPr>
-      <w:r>
-        <w:t>-  notebook/gravedad_comercio_peru.ipynb — notebook narrado con el mismo</w:t>
-      </w:r>
-    </w:p>
-    <w:p>
-      <w:pPr>
-        <w:pStyle w:val="Body"/>
-      </w:pPr>
-      <w:r>
-        <w:t>recorrido para ambos lados (Parte 1: exportaciones, Parte 2: importaciones),</w:t>
-      </w:r>
-    </w:p>
-    <w:p>
-      <w:pPr>
-        <w:pStyle w:val="Body"/>
-      </w:pPr>
-      <w:r>
-        <w:t>ejecutado con outputs reales.</w:t>
+        <w:t>importaciones) están disponibles previa solicitud a los autores.</w:t>
       </w:r>
     </w:p>
     <w:sectPr>

</xml_diff>

<commit_message>
feat(gravedad-comercio-bilateral-peru): credencial del autor y narrativa enriquecida
Agrega credencial del autor (economista, asistente de investigacion CIUP)
a ambos papers.

Reescribe el paper con voz experta por disciplina: economia del comercio
(resistencia multilateral, Anderson-van Wincoop), econometria aplicada
(diagnostico VIF/residuos de Pearson con mas rigor), economia de
commodities (participacion real de Suiza en refinacion de oro, SECO 2023;
especificidad tecnica de la fundicion Tsumeb), estadistica de comercio
(efecto Rotterdam-Amberes con nombre propio y cifra UNCTAD de
reexportaciones), y cadenas de valor globales (cita a Autor, Dorn y
Hanson 2013 para la concentracion de importaciones en manufactura
asiatica). Agrega y verifica 3 referencias nuevas.
</commit_message>
<xml_diff>
--- a/investigaciones/gravedad-comercio-bilateral-peru/paper/Paper-BCRP-Estudios-Economicos.docx
+++ b/investigaciones/gravedad-comercio-bilateral-peru/paper/Paper-BCRP-Estudios-Economicos.docx
@@ -24,7 +24,7 @@
         <w:pStyle w:val="PaperAffil"/>
       </w:pPr>
       <w:r>
-        <w:t>¹ Octubre 2026.</w:t>
+        <w:t>¹ Economista. Asistente de investigación, Centro de Investigación de la Universidad del Pacífico (CIUP). Octubre 2026.</w:t>
       </w:r>
     </w:p>
     <w:p/>
@@ -281,135 +281,367 @@
         <w:pStyle w:val="Body"/>
       </w:pPr>
       <w:r>
-        <w:t>Los modelos de gravedad son el instrumento estándar en economía del comercio</w:t>
-      </w:r>
-    </w:p>
-    <w:p>
-      <w:pPr>
-        <w:pStyle w:val="Body"/>
-      </w:pPr>
-      <w:r>
-        <w:t>internacional para explicar el volumen de comercio bilateral a partir del</w:t>
-      </w:r>
-    </w:p>
-    <w:p>
-      <w:pPr>
-        <w:pStyle w:val="Body"/>
-      </w:pPr>
-      <w:r>
-        <w:t>tamaño de las economías y la distancia (física, cultural, institucional)</w:t>
-      </w:r>
-    </w:p>
-    <w:p>
-      <w:pPr>
-        <w:pStyle w:val="Body"/>
-      </w:pPr>
-      <w:r>
-        <w:t>entre ellas (Tinbergen, 1962; Anderson y van Wincoop, 2003). Santos Silva y</w:t>
-      </w:r>
-    </w:p>
-    <w:p>
-      <w:pPr>
-        <w:pStyle w:val="Body"/>
-      </w:pPr>
-      <w:r>
-        <w:t>Tenreyro (2006) mostraron que la estimación log-lineal por MCO está sesgada</w:t>
-      </w:r>
-    </w:p>
-    <w:p>
-      <w:pPr>
-        <w:pStyle w:val="Body"/>
-      </w:pPr>
-      <w:r>
-        <w:t>bajo heterocedasticidad y subestima sistemáticamente el comercio entre países</w:t>
-      </w:r>
-    </w:p>
-    <w:p>
-      <w:pPr>
-        <w:pStyle w:val="Body"/>
-      </w:pPr>
-      <w:r>
-        <w:t>distantes, y propusieron PPML (Poisson pseudo-maximum likelihood) como</w:t>
-      </w:r>
-    </w:p>
-    <w:p>
-      <w:pPr>
-        <w:pStyle w:val="Body"/>
-      </w:pPr>
-      <w:r>
-        <w:t>alternativa consistente que además no requiere descartar observaciones de</w:t>
-      </w:r>
-    </w:p>
-    <w:p>
-      <w:pPr>
-        <w:pStyle w:val="Body"/>
-      </w:pPr>
-      <w:r>
-        <w:t>comercio cero.</w:t>
-      </w:r>
-    </w:p>
-    <w:p>
-      <w:pPr>
-        <w:pStyle w:val="Body"/>
-      </w:pPr>
-      <w:r>
-        <w:t>Perú es un caso particularmente informativo para poner a prueba estas</w:t>
-      </w:r>
-    </w:p>
-    <w:p>
-      <w:pPr>
-        <w:pStyle w:val="Body"/>
-      </w:pPr>
-      <w:r>
-        <w:t>herramientas: es una economía exportadora de commodities (cobre, oro, gas</w:t>
-      </w:r>
-    </w:p>
-    <w:p>
-      <w:pPr>
-        <w:pStyle w:val="Body"/>
-      </w:pPr>
-      <w:r>
-        <w:t>natural licuado) cuya estructura comercial está fuertemente determinada por</w:t>
-      </w:r>
-    </w:p>
-    <w:p>
-      <w:pPr>
-        <w:pStyle w:val="Body"/>
-      </w:pPr>
-      <w:r>
-        <w:t>cadenas de procesamiento y logística global, no solo por demanda final</w:t>
-      </w:r>
-    </w:p>
-    <w:p>
-      <w:pPr>
-        <w:pStyle w:val="Body"/>
-      </w:pPr>
-      <w:r>
-        <w:t>bilateral. Este trabajo documenta, paso a paso, cómo esa estructura</w:t>
-      </w:r>
-    </w:p>
-    <w:p>
-      <w:pPr>
-        <w:pStyle w:val="Body"/>
-      </w:pPr>
-      <w:r>
-        <w:t>contamina una estimación de gravedad "de manual" y cómo corregirla sin caer</w:t>
-      </w:r>
-    </w:p>
-    <w:p>
-      <w:pPr>
-        <w:pStyle w:val="Body"/>
-      </w:pPr>
-      <w:r>
-        <w:t>en data dredging (ajustar el filtro de datos hasta obtener el resultado</w:t>
-      </w:r>
-    </w:p>
-    <w:p>
-      <w:pPr>
-        <w:pStyle w:val="Body"/>
-      </w:pPr>
-      <w:r>
-        <w:t>deseado).</w:t>
+        <w:t>Desde su formulación original (Tinbergen, 1962), el modelo de gravedad ha</w:t>
+      </w:r>
+    </w:p>
+    <w:p>
+      <w:pPr>
+        <w:pStyle w:val="Body"/>
+      </w:pPr>
+      <w:r>
+        <w:t>sido la herramienta dominante en economía del comercio internacional para</w:t>
+      </w:r>
+    </w:p>
+    <w:p>
+      <w:pPr>
+        <w:pStyle w:val="Body"/>
+      </w:pPr>
+      <w:r>
+        <w:t>explicar el volumen de comercio bilateral a partir del tamaño de las</w:t>
+      </w:r>
+    </w:p>
+    <w:p>
+      <w:pPr>
+        <w:pStyle w:val="Body"/>
+      </w:pPr>
+      <w:r>
+        <w:t>economías involucradas y la distancia —física, cultural, institucional—</w:t>
+      </w:r>
+    </w:p>
+    <w:p>
+      <w:pPr>
+        <w:pStyle w:val="Body"/>
+      </w:pPr>
+      <w:r>
+        <w:t>que las separa. Su atractivo empírico (pocas variables, ajuste</w:t>
+      </w:r>
+    </w:p>
+    <w:p>
+      <w:pPr>
+        <w:pStyle w:val="Body"/>
+      </w:pPr>
+      <w:r>
+        <w:t>consistentemente alto) convive con una historia de fragilidad</w:t>
+      </w:r>
+    </w:p>
+    <w:p>
+      <w:pPr>
+        <w:pStyle w:val="Body"/>
+      </w:pPr>
+      <w:r>
+        <w:t>microfundamental que tomó tres décadas en resolverse del todo. Anderson y</w:t>
+      </w:r>
+    </w:p>
+    <w:p>
+      <w:pPr>
+        <w:pStyle w:val="Body"/>
+      </w:pPr>
+      <w:r>
+        <w:t>van Wincoop (2003) mostraron que una especificación de gravedad sin los</w:t>
+      </w:r>
+    </w:p>
+    <w:p>
+      <w:pPr>
+        <w:pStyle w:val="Body"/>
+      </w:pPr>
+      <w:r>
+        <w:t>términos de "resistencia multilateral" —el costo relativo de comerciar con</w:t>
+      </w:r>
+    </w:p>
+    <w:p>
+      <w:pPr>
+        <w:pStyle w:val="Body"/>
+      </w:pPr>
+      <w:r>
+        <w:t>un socio frente al costo de comerciar con el resto del mundo— produce</w:t>
+      </w:r>
+    </w:p>
+    <w:p>
+      <w:pPr>
+        <w:pStyle w:val="Body"/>
+      </w:pPr>
+      <w:r>
+        <w:t>estimaciones sesgadas del efecto de la distancia y de las fronteras, el</w:t>
+      </w:r>
+    </w:p>
+    <w:p>
+      <w:pPr>
+        <w:pStyle w:val="Body"/>
+      </w:pPr>
+      <w:r>
+        <w:t>célebre border puzzle. Santos Silva y Tenreyro (2006) identificaron un</w:t>
+      </w:r>
+    </w:p>
+    <w:p>
+      <w:pPr>
+        <w:pStyle w:val="Body"/>
+      </w:pPr>
+      <w:r>
+        <w:t>segundo problema, distinto pero igual de consecuente: la práctica estándar</w:t>
+      </w:r>
+    </w:p>
+    <w:p>
+      <w:pPr>
+        <w:pStyle w:val="Body"/>
+      </w:pPr>
+      <w:r>
+        <w:t>de linealizar la ecuación de gravedad tomando logaritmos e introduciendo</w:t>
+      </w:r>
+    </w:p>
+    <w:p>
+      <w:pPr>
+        <w:pStyle w:val="Body"/>
+      </w:pPr>
+      <w:r>
+        <w:t>MCO produce estimadores inconsistentes bajo heterocedasticidad (un supuesto</w:t>
+      </w:r>
+    </w:p>
+    <w:p>
+      <w:pPr>
+        <w:pStyle w:val="Body"/>
+      </w:pPr>
+      <w:r>
+        <w:t>que la teoría no da razón para descartar) y obliga a eliminar del panel</w:t>
+      </w:r>
+    </w:p>
+    <w:p>
+      <w:pPr>
+        <w:pStyle w:val="Body"/>
+      </w:pPr>
+      <w:r>
+        <w:t>toda observación de comercio cero, lo que sesga sistemáticamente a la baja</w:t>
+      </w:r>
+    </w:p>
+    <w:p>
+      <w:pPr>
+        <w:pStyle w:val="Body"/>
+      </w:pPr>
+      <w:r>
+        <w:t>el coeficiente de distancia. Su solución —estimar en niveles por</w:t>
+      </w:r>
+    </w:p>
+    <w:p>
+      <w:pPr>
+        <w:pStyle w:val="Body"/>
+      </w:pPr>
+      <w:r>
+        <w:t>pseudo-máxima verosimilitud de Poisson (PPML)— es hoy el estándar de la</w:t>
+      </w:r>
+    </w:p>
+    <w:p>
+      <w:pPr>
+        <w:pStyle w:val="Body"/>
+      </w:pPr>
+      <w:r>
+        <w:t>literatura aplicada (Head y Mayer, 2014) precisamente porque corrige ambos</w:t>
+      </w:r>
+    </w:p>
+    <w:p>
+      <w:pPr>
+        <w:pStyle w:val="Body"/>
+      </w:pPr>
+      <w:r>
+        <w:t>problemas a la vez: es consistente ante heterocedasticidad no especificada</w:t>
+      </w:r>
+    </w:p>
+    <w:p>
+      <w:pPr>
+        <w:pStyle w:val="Body"/>
+      </w:pPr>
+      <w:r>
+        <w:t>y admite el panel completo, ceros incluidos.</w:t>
+      </w:r>
+    </w:p>
+    <w:p>
+      <w:pPr>
+        <w:pStyle w:val="Body"/>
+      </w:pPr>
+      <w:r>
+        <w:t>Estas dos correcciones, sin embargo, resuelven un problema de forma</w:t>
+      </w:r>
+    </w:p>
+    <w:p>
+      <w:pPr>
+        <w:pStyle w:val="Body"/>
+      </w:pPr>
+      <w:r>
+        <w:t>funcional del modelo, no un problema de qué mide la variable dependiente.</w:t>
+      </w:r>
+    </w:p>
+    <w:p>
+      <w:pPr>
+        <w:pStyle w:val="Body"/>
+      </w:pPr>
+      <w:r>
+        <w:t>Este trabajo documenta un tercer tipo de sesgo, de naturaleza distinta y</w:t>
+      </w:r>
+    </w:p>
+    <w:p>
+      <w:pPr>
+        <w:pStyle w:val="Body"/>
+      </w:pPr>
+      <w:r>
+        <w:t>hasta donde conocemos no tratado con el mismo detalle empírico en la</w:t>
+      </w:r>
+    </w:p>
+    <w:p>
+      <w:pPr>
+        <w:pStyle w:val="Body"/>
+      </w:pPr>
+      <w:r>
+        <w:t>literatura de gravedad aplicada a economías latinoamericanas: el que surge</w:t>
+      </w:r>
+    </w:p>
+    <w:p>
+      <w:pPr>
+        <w:pStyle w:val="Body"/>
+      </w:pPr>
+      <w:r>
+        <w:t>cuando el valor de la exportación o importación bilateral no refleja la</w:t>
+      </w:r>
+    </w:p>
+    <w:p>
+      <w:pPr>
+        <w:pStyle w:val="Body"/>
+      </w:pPr>
+      <w:r>
+        <w:t>relación económica entre el país declarante y el socio de destino, sino la</w:t>
+      </w:r>
+    </w:p>
+    <w:p>
+      <w:pPr>
+        <w:pStyle w:val="Body"/>
+      </w:pPr>
+      <w:r>
+        <w:t>geografía de la logística global —refinación de metales, fundición de</w:t>
+      </w:r>
+    </w:p>
+    <w:p>
+      <w:pPr>
+        <w:pStyle w:val="Body"/>
+      </w:pPr>
+      <w:r>
+        <w:t>concentrados, tránsito portuario— superpuesta sobre ella. Perú es un caso</w:t>
+      </w:r>
+    </w:p>
+    <w:p>
+      <w:pPr>
+        <w:pStyle w:val="Body"/>
+      </w:pPr>
+      <w:r>
+        <w:t>particularmente informativo para exponerlo: es, simultáneamente, una</w:t>
+      </w:r>
+    </w:p>
+    <w:p>
+      <w:pPr>
+        <w:pStyle w:val="Body"/>
+      </w:pPr>
+      <w:r>
+        <w:t>economía exportadora de commodities mineros y energéticos (cobre, oro, gas</w:t>
+      </w:r>
+    </w:p>
+    <w:p>
+      <w:pPr>
+        <w:pStyle w:val="Body"/>
+      </w:pPr>
+      <w:r>
+        <w:t>natural licuado) cuya estructura exportadora está mediada por cadenas de</w:t>
+      </w:r>
+    </w:p>
+    <w:p>
+      <w:pPr>
+        <w:pStyle w:val="Body"/>
+      </w:pPr>
+      <w:r>
+        <w:t>procesamiento global, y una economía importadora de manufacturas cuya</w:t>
+      </w:r>
+    </w:p>
+    <w:p>
+      <w:pPr>
+        <w:pStyle w:val="Body"/>
+      </w:pPr>
+      <w:r>
+        <w:t>estructura está mediada por la geografía de la producción industrial</w:t>
+      </w:r>
+    </w:p>
+    <w:p>
+      <w:pPr>
+        <w:pStyle w:val="Body"/>
+      </w:pPr>
+      <w:r>
+        <w:t>mundial. Ambos rasgos, veremos, distorsionan un modelo de gravedad "de</w:t>
+      </w:r>
+    </w:p>
+    <w:p>
+      <w:pPr>
+        <w:pStyle w:val="Body"/>
+      </w:pPr>
+      <w:r>
+        <w:t>manual" de maneras opuestas. El aporte de este trabajo es metodológico:</w:t>
+      </w:r>
+    </w:p>
+    <w:p>
+      <w:pPr>
+        <w:pStyle w:val="Body"/>
+      </w:pPr>
+      <w:r>
+        <w:t>documentar, con el mismo rigor y la misma vara para ambas direcciones del</w:t>
+      </w:r>
+    </w:p>
+    <w:p>
+      <w:pPr>
+        <w:pStyle w:val="Body"/>
+      </w:pPr>
+      <w:r>
+        <w:t>comercio, cómo diagnosticar esta contaminación mediante el análisis de</w:t>
+      </w:r>
+    </w:p>
+    <w:p>
+      <w:pPr>
+        <w:pStyle w:val="Body"/>
+      </w:pPr>
+      <w:r>
+        <w:t>residuos, cómo corregirla sin incurrir en data dredging (ajustar el</w:t>
+      </w:r>
+    </w:p>
+    <w:p>
+      <w:pPr>
+        <w:pStyle w:val="Body"/>
+      </w:pPr>
+      <w:r>
+        <w:t>filtro de datos observación por observación hasta obtener el resultado que</w:t>
+      </w:r>
+    </w:p>
+    <w:p>
+      <w:pPr>
+        <w:pStyle w:val="Body"/>
+      </w:pPr>
+      <w:r>
+        <w:t>se busca), y —el punto que distingue este ejercicio de una simple limpieza</w:t>
+      </w:r>
+    </w:p>
+    <w:p>
+      <w:pPr>
+        <w:pStyle w:val="Body"/>
+      </w:pPr>
+      <w:r>
+        <w:t>de datos— cómo reconocer cuándo la corrección no corresponde porque el</w:t>
+      </w:r>
+    </w:p>
+    <w:p>
+      <w:pPr>
+        <w:pStyle w:val="Body"/>
+      </w:pPr>
+      <w:r>
+        <w:t>patrón observado, aunque contraintuitivo, es economía real y no artefacto</w:t>
+      </w:r>
+    </w:p>
+    <w:p>
+      <w:pPr>
+        <w:pStyle w:val="Body"/>
+      </w:pPr>
+      <w:r>
+        <w:t>de medición.</w:t>
       </w:r>
     </w:p>
     <w:p>
@@ -1461,55 +1693,151 @@
         <w:pStyle w:val="Body"/>
       </w:pPr>
       <w:r>
-        <w:t>Se descartó la hipótesis de colinealidad entre PBI y distancia (los países</w:t>
-      </w:r>
-    </w:p>
-    <w:p>
-      <w:pPr>
-        <w:pStyle w:val="Body"/>
-      </w:pPr>
-      <w:r>
-        <w:t>grandes y lejanos, como China, podrían estar confundiendo ambos</w:t>
-      </w:r>
-    </w:p>
-    <w:p>
-      <w:pPr>
-        <w:pStyle w:val="Body"/>
-      </w:pPr>
-      <w:r>
-        <w:t>coeficientes): el factor de inflación de varianza de log_dist es 2.08, y la</w:t>
-      </w:r>
-    </w:p>
-    <w:p>
-      <w:pPr>
-        <w:pStyle w:val="Body"/>
-      </w:pPr>
-      <w:r>
-        <w:t>correlación simple entre log(PBI) y log(distancia) es de solo 0.17. El</w:t>
-      </w:r>
-    </w:p>
-    <w:p>
-      <w:pPr>
-        <w:pStyle w:val="Body"/>
-      </w:pPr>
-      <w:r>
-        <w:t>diagnóstico correcto es el análisis de residuos de Pearson: dos observaciones</w:t>
-      </w:r>
-    </w:p>
-    <w:p>
-      <w:pPr>
-        <w:pStyle w:val="Body"/>
-      </w:pPr>
-      <w:r>
-        <w:t>dominan por completo el ajuste de la verosimilitud de Poisson, que pondera</w:t>
-      </w:r>
-    </w:p>
-    <w:p>
-      <w:pPr>
-        <w:pStyle w:val="Body"/>
-      </w:pPr>
-      <w:r>
-        <w:t>fuertemente los valores grandes.</w:t>
+        <w:t>Una primera hipótesis, razonable antes de mirar los datos, es que el</w:t>
+      </w:r>
+    </w:p>
+    <w:p>
+      <w:pPr>
+        <w:pStyle w:val="Body"/>
+      </w:pPr>
+      <w:r>
+        <w:t>coeficiente de distancia esté capturando una colinealidad espuria con el</w:t>
+      </w:r>
+    </w:p>
+    <w:p>
+      <w:pPr>
+        <w:pStyle w:val="Body"/>
+      </w:pPr>
+      <w:r>
+        <w:t>tamaño del socio: si los países más grandes de la muestra (China, Estados</w:t>
+      </w:r>
+    </w:p>
+    <w:p>
+      <w:pPr>
+        <w:pStyle w:val="Body"/>
+      </w:pPr>
+      <w:r>
+        <w:t>Unidos) resultan ser también, en promedio, los más lejanos, un estimador</w:t>
+      </w:r>
+    </w:p>
+    <w:p>
+      <w:pPr>
+        <w:pStyle w:val="Body"/>
+      </w:pPr>
+      <w:r>
+        <w:t>que no logra separar ambos efectos podría trasladarle al coeficiente de</w:t>
+      </w:r>
+    </w:p>
+    <w:p>
+      <w:pPr>
+        <w:pStyle w:val="Body"/>
+      </w:pPr>
+      <w:r>
+        <w:t>distancia parte de la varianza que en realidad explica el PBI. Esta</w:t>
+      </w:r>
+    </w:p>
+    <w:p>
+      <w:pPr>
+        <w:pStyle w:val="Body"/>
+      </w:pPr>
+      <w:r>
+        <w:t>hipótesis se descarta con evidencia, no por supuesto: el factor de</w:t>
+      </w:r>
+    </w:p>
+    <w:p>
+      <w:pPr>
+        <w:pStyle w:val="Body"/>
+      </w:pPr>
+      <w:r>
+        <w:t>inflación de varianza (VIF) de log_dist es 2.08 —muy por debajo del</w:t>
+      </w:r>
+    </w:p>
+    <w:p>
+      <w:pPr>
+        <w:pStyle w:val="Body"/>
+      </w:pPr>
+      <w:r>
+        <w:t>umbral convencional de 5 o 10 que señalaría colinealidad problemática— y la</w:t>
+      </w:r>
+    </w:p>
+    <w:p>
+      <w:pPr>
+        <w:pStyle w:val="Body"/>
+      </w:pPr>
+      <w:r>
+        <w:t>correlación simple entre log(PBI) y log(distancia) es de apenas 0.17.</w:t>
+      </w:r>
+    </w:p>
+    <w:p>
+      <w:pPr>
+        <w:pStyle w:val="Body"/>
+      </w:pPr>
+      <w:r>
+        <w:t>El diagnóstico que sí resulta informativo es el análisis de los residuos de</w:t>
+      </w:r>
+    </w:p>
+    <w:p>
+      <w:pPr>
+        <w:pStyle w:val="Body"/>
+      </w:pPr>
+      <w:r>
+        <w:t>Pearson de la verosimilitud de Poisson, que por construcción pondera con</w:t>
+      </w:r>
+    </w:p>
+    <w:p>
+      <w:pPr>
+        <w:pStyle w:val="Body"/>
+      </w:pPr>
+      <w:r>
+        <w:t>mayor peso las observaciones de valor absoluto más alto: en un panel con</w:t>
+      </w:r>
+    </w:p>
+    <w:p>
+      <w:pPr>
+        <w:pStyle w:val="Body"/>
+      </w:pPr>
+      <w:r>
+        <w:t>una dispersión de escala tan amplia como el comercio exterior (de cientos</w:t>
+      </w:r>
+    </w:p>
+    <w:p>
+      <w:pPr>
+        <w:pStyle w:val="Body"/>
+      </w:pPr>
+      <w:r>
+        <w:t>de miles de dólares a miles de millones), un puñado de observaciones puede</w:t>
+      </w:r>
+    </w:p>
+    <w:p>
+      <w:pPr>
+        <w:pStyle w:val="Body"/>
+      </w:pPr>
+      <w:r>
+        <w:t>dominar por completo el ajuste sin que ningún diagnóstico de</w:t>
+      </w:r>
+    </w:p>
+    <w:p>
+      <w:pPr>
+        <w:pStyle w:val="Body"/>
+      </w:pPr>
+      <w:r>
+        <w:t>multicolinealidad lo revele, precisamente porque el problema no está en la</w:t>
+      </w:r>
+    </w:p>
+    <w:p>
+      <w:pPr>
+        <w:pStyle w:val="Body"/>
+      </w:pPr>
+      <w:r>
+        <w:t>estructura de correlación de los regresores sino en la variable dependiente</w:t>
+      </w:r>
+    </w:p>
+    <w:p>
+      <w:pPr>
+        <w:pStyle w:val="Body"/>
+      </w:pPr>
+      <w:r>
+        <w:t>misma.</w:t>
       </w:r>
     </w:p>
     <w:p>
@@ -1714,63 +2042,159 @@
         <w:pStyle w:val="Body"/>
       </w:pPr>
       <w:r>
-        <w:t>Suiza es uno de los principales centros mundiales de refinación de oro; el</w:t>
-      </w:r>
-    </w:p>
-    <w:p>
-      <w:pPr>
-        <w:pStyle w:val="Body"/>
-      </w:pPr>
-      <w:r>
-        <w:t>oro peruano se envía allí para refinarse, no por el tamaño de la economía</w:t>
-      </w:r>
-    </w:p>
-    <w:p>
-      <w:pPr>
-        <w:pStyle w:val="Body"/>
-      </w:pPr>
-      <w:r>
-        <w:t>suiza como mercado de consumo. Namibia alberga la fundición Tsumeb (Dundee</w:t>
-      </w:r>
-    </w:p>
-    <w:p>
-      <w:pPr>
-        <w:pStyle w:val="Body"/>
-      </w:pPr>
-      <w:r>
-        <w:t>Precious Metals), especializada en procesar concentrados de cobre con alto</w:t>
-      </w:r>
-    </w:p>
-    <w:p>
-      <w:pPr>
-        <w:pStyle w:val="Body"/>
-      </w:pPr>
-      <w:r>
-        <w:t>contenido de arsénico — como los de minas peruanas difíciles de procesar en</w:t>
-      </w:r>
-    </w:p>
-    <w:p>
-      <w:pPr>
-        <w:pStyle w:val="Body"/>
-      </w:pPr>
-      <w:r>
-        <w:t>otra parte. Ambos son flujos reales, pero reflejan logística de</w:t>
-      </w:r>
-    </w:p>
-    <w:p>
-      <w:pPr>
-        <w:pStyle w:val="Body"/>
-      </w:pPr>
-      <w:r>
-        <w:t>procesamiento de materias primas, no demanda final del país de destino: el</w:t>
-      </w:r>
-    </w:p>
-    <w:p>
-      <w:pPr>
-        <w:pStyle w:val="Body"/>
-      </w:pPr>
-      <w:r>
-        <w:t>supuesto implícito del modelo de gravedad.</w:t>
+        <w:t>La explicación no es estadística sino industrial. Suiza concentra,</w:t>
+      </w:r>
+    </w:p>
+    <w:p>
+      <w:pPr>
+        <w:pStyle w:val="Body"/>
+      </w:pPr>
+      <w:r>
+        <w:t>dependiendo de la fuente y del año, entre un tercio y dos quintos de la</w:t>
+      </w:r>
+    </w:p>
+    <w:p>
+      <w:pPr>
+        <w:pStyle w:val="Body"/>
+      </w:pPr>
+      <w:r>
+        <w:t>capacidad mundial de refinación de oro —el Secretariado de Estado de</w:t>
+      </w:r>
+    </w:p>
+    <w:p>
+      <w:pPr>
+        <w:pStyle w:val="Body"/>
+      </w:pPr>
+      <w:r>
+        <w:t>Economía suizo (SECO) reportó una participación del 34% del oro refinado</w:t>
+      </w:r>
+    </w:p>
+    <w:p>
+      <w:pPr>
+        <w:pStyle w:val="Body"/>
+      </w:pPr>
+      <w:r>
+        <w:t>mundial en 2023 (swissinfo.ch, 2025)—, de modo que una parte sustancial del</w:t>
+      </w:r>
+    </w:p>
+    <w:p>
+      <w:pPr>
+        <w:pStyle w:val="Body"/>
+      </w:pPr>
+      <w:r>
+        <w:t>oro extraído en cualquier punto del planeta, Perú incluido, transita por</w:t>
+      </w:r>
+    </w:p>
+    <w:p>
+      <w:pPr>
+        <w:pStyle w:val="Body"/>
+      </w:pPr>
+      <w:r>
+        <w:t>refinerías suizas antes de incorporarse al mercado internacional como</w:t>
+      </w:r>
+    </w:p>
+    <w:p>
+      <w:pPr>
+        <w:pStyle w:val="Body"/>
+      </w:pPr>
+      <w:r>
+        <w:t>lingote certificado. El valor que BACI registra como "exportación a Suiza"</w:t>
+      </w:r>
+    </w:p>
+    <w:p>
+      <w:pPr>
+        <w:pStyle w:val="Body"/>
+      </w:pPr>
+      <w:r>
+        <w:t>no mide, entonces, cuánto oro demanda la economía suiza como consumidor</w:t>
+      </w:r>
+    </w:p>
+    <w:p>
+      <w:pPr>
+        <w:pStyle w:val="Body"/>
+      </w:pPr>
+      <w:r>
+        <w:t>final —una cifra irrelevante frente al tamaño real del flujo— sino cuánto</w:t>
+      </w:r>
+    </w:p>
+    <w:p>
+      <w:pPr>
+        <w:pStyle w:val="Body"/>
+      </w:pPr>
+      <w:r>
+        <w:t>oro pasa por su industria de refinación camino a terceros mercados. Namibia</w:t>
+      </w:r>
+    </w:p>
+    <w:p>
+      <w:pPr>
+        <w:pStyle w:val="Body"/>
+      </w:pPr>
+      <w:r>
+        <w:t>ofrece un ejemplo más específico de la misma lógica: alberga la fundición</w:t>
+      </w:r>
+    </w:p>
+    <w:p>
+      <w:pPr>
+        <w:pStyle w:val="Body"/>
+      </w:pPr>
+      <w:r>
+        <w:t>de Tsumeb (Dundee Precious Metals), una de las pocas plantas en el mundo</w:t>
+      </w:r>
+    </w:p>
+    <w:p>
+      <w:pPr>
+        <w:pStyle w:val="Body"/>
+      </w:pPr>
+      <w:r>
+        <w:t>metalúrgicamente equipadas para procesar concentrados de cobre con alto</w:t>
+      </w:r>
+    </w:p>
+    <w:p>
+      <w:pPr>
+        <w:pStyle w:val="Body"/>
+      </w:pPr>
+      <w:r>
+        <w:t>contenido de arsénico, precisamente el perfil geoquímico de varios</w:t>
+      </w:r>
+    </w:p>
+    <w:p>
+      <w:pPr>
+        <w:pStyle w:val="Body"/>
+      </w:pPr>
+      <w:r>
+        <w:t>yacimientos peruanos cuyo concentrado no puede procesarse en fundiciones</w:t>
+      </w:r>
+    </w:p>
+    <w:p>
+      <w:pPr>
+        <w:pStyle w:val="Body"/>
+      </w:pPr>
+      <w:r>
+        <w:t>convencionales sin penalidades o inversión adicional en control de</w:t>
+      </w:r>
+    </w:p>
+    <w:p>
+      <w:pPr>
+        <w:pStyle w:val="Body"/>
+      </w:pPr>
+      <w:r>
+        <w:t>emisiones. En ambos casos el flujo es real y el valor declarado es</w:t>
+      </w:r>
+    </w:p>
+    <w:p>
+      <w:pPr>
+        <w:pStyle w:val="Body"/>
+      </w:pPr>
+      <w:r>
+        <w:t>correcto; lo que falla es el supuesto que el modelo de gravedad hace sobre</w:t>
+      </w:r>
+    </w:p>
+    <w:p>
+      <w:pPr>
+        <w:pStyle w:val="Body"/>
+      </w:pPr>
+      <w:r>
+        <w:t>él —que refleja demanda final del país de destino— y no el dato en sí.</w:t>
       </w:r>
     </w:p>
     <w:p>
@@ -2299,39 +2723,119 @@
         <w:pStyle w:val="Body"/>
       </w:pPr>
       <w:r>
-        <w:t>el país que más domina el ajuste pasa a ser Países Bajos — el clásico</w:t>
-      </w:r>
-    </w:p>
-    <w:p>
-      <w:pPr>
-        <w:pStyle w:val="Body"/>
-      </w:pPr>
-      <w:r>
-        <w:t>"efecto Róterdam": mercancía declarada hacia un puerto-hub europeo para</w:t>
-      </w:r>
-    </w:p>
-    <w:p>
-      <w:pPr>
-        <w:pStyle w:val="Body"/>
-      </w:pPr>
-      <w:r>
-        <w:t>redistribuirse dentro de la Unión Europea, no para consumo neerlandés real.</w:t>
-      </w:r>
-    </w:p>
-    <w:p>
-      <w:pPr>
-        <w:pStyle w:val="Body"/>
-      </w:pPr>
-      <w:r>
-        <w:t>Reino Unido y Panamá (zona del Canal) aparecen también entre los residuos más</w:t>
-      </w:r>
-    </w:p>
-    <w:p>
-      <w:pPr>
-        <w:pStyle w:val="Body"/>
-      </w:pPr>
-      <w:r>
-        <w:t>altos.</w:t>
+        <w:t>el país que más domina el ajuste pasa a ser Países Bajos, seguido de</w:t>
+      </w:r>
+    </w:p>
+    <w:p>
+      <w:pPr>
+        <w:pStyle w:val="Body"/>
+      </w:pPr>
+      <w:r>
+        <w:t>Reino Unido y Panamá. El fenómeno tiene nombre propio en la literatura de</w:t>
+      </w:r>
+    </w:p>
+    <w:p>
+      <w:pPr>
+        <w:pStyle w:val="Body"/>
+      </w:pPr>
+      <w:r>
+        <w:t>estadística de comercio: el "efecto Róterdam-Amberes" (*Rotterdam-Antwerp</w:t>
+      </w:r>
+    </w:p>
+    <w:p>
+      <w:pPr>
+        <w:pStyle w:val="Body"/>
+      </w:pPr>
+      <w:r>
+        <w:t>effect*), documentado por las autoridades estadísticas europeas y por</w:t>
+      </w:r>
+    </w:p>
+    <w:p>
+      <w:pPr>
+        <w:pStyle w:val="Body"/>
+      </w:pPr>
+      <w:r>
+        <w:t>estudios de la propia Oficina Central de Estadística neerlandesa, describe</w:t>
+      </w:r>
+    </w:p>
+    <w:p>
+      <w:pPr>
+        <w:pStyle w:val="Body"/>
+      </w:pPr>
+      <w:r>
+        <w:t>la sobreestimación sistemática de las cifras de comercio de un país-puerto</w:t>
+      </w:r>
+    </w:p>
+    <w:p>
+      <w:pPr>
+        <w:pStyle w:val="Body"/>
+      </w:pPr>
+      <w:r>
+        <w:t>cuando la mercancía declarada en aduana como destinada a él en realidad</w:t>
+      </w:r>
+    </w:p>
+    <w:p>
+      <w:pPr>
+        <w:pStyle w:val="Body"/>
+      </w:pPr>
+      <w:r>
+        <w:t>continúa, sin transformación sustancial, hacia un tercer país. No es un</w:t>
+      </w:r>
+    </w:p>
+    <w:p>
+      <w:pPr>
+        <w:pStyle w:val="Body"/>
+      </w:pPr>
+      <w:r>
+        <w:t>fenómeno marginal: la UNCTAD documenta que las reexportaciones representan</w:t>
+      </w:r>
+    </w:p>
+    <w:p>
+      <w:pPr>
+        <w:pStyle w:val="Body"/>
+      </w:pPr>
+      <w:r>
+        <w:t>más del 40% de las exportaciones totales de Hong Kong, Singapur, Países</w:t>
+      </w:r>
+    </w:p>
+    <w:p>
+      <w:pPr>
+        <w:pStyle w:val="Body"/>
+      </w:pPr>
+      <w:r>
+        <w:t>Bajos y Chipre —las economías-puerto por excelencia del comercio mundial—,</w:t>
+      </w:r>
+    </w:p>
+    <w:p>
+      <w:pPr>
+        <w:pStyle w:val="Body"/>
+      </w:pPr>
+      <w:r>
+        <w:t>proporción que en un panel de gravedad bilateral infla artificialmente el</w:t>
+      </w:r>
+    </w:p>
+    <w:p>
+      <w:pPr>
+        <w:pStyle w:val="Body"/>
+      </w:pPr>
+      <w:r>
+        <w:t>coeficiente asociado a esos socios sin que exista, del lado del país</w:t>
+      </w:r>
+    </w:p>
+    <w:p>
+      <w:pPr>
+        <w:pStyle w:val="Body"/>
+      </w:pPr>
+      <w:r>
+        <w:t>exportador, ninguna razón económica real para privilegiarlos frente a</w:t>
+      </w:r>
+    </w:p>
+    <w:p>
+      <w:pPr>
+        <w:pStyle w:val="Body"/>
+      </w:pPr>
+      <w:r>
+        <w:t>otros destinos de tamaño comparable.</w:t>
       </w:r>
     </w:p>
     <w:p>
@@ -2355,47 +2859,71 @@
         <w:pStyle w:val="Body"/>
       </w:pPr>
       <w:r>
-        <w:t>lograr el resultado deseado—, se adoptó la lista estándar de la literatura</w:t>
-      </w:r>
-    </w:p>
-    <w:p>
-      <w:pPr>
-        <w:pStyle w:val="Body"/>
-      </w:pPr>
-      <w:r>
-        <w:t>de hubs de reexportación: Países Bajos, Bélgica, Singapur, Hong Kong, Panamá</w:t>
-      </w:r>
-    </w:p>
-    <w:p>
-      <w:pPr>
-        <w:pStyle w:val="Body"/>
-      </w:pPr>
-      <w:r>
-        <w:t>y Emiratos Árabes Unidos (el eje Róterdam-Amberes-Singapur-Hong</w:t>
-      </w:r>
-    </w:p>
-    <w:p>
-      <w:pPr>
-        <w:pStyle w:val="Body"/>
-      </w:pPr>
-      <w:r>
-        <w:t>Kong-Panamá-Dubái). Esta lista se fija a priori, por la clasificación</w:t>
-      </w:r>
-    </w:p>
-    <w:p>
-      <w:pPr>
-        <w:pStyle w:val="Body"/>
-      </w:pPr>
-      <w:r>
-        <w:t>habitual en estudios de comercio, no por los residuos de este dataset</w:t>
-      </w:r>
-    </w:p>
-    <w:p>
-      <w:pPr>
-        <w:pStyle w:val="Body"/>
-      </w:pPr>
-      <w:r>
-        <w:t>específico.</w:t>
+        <w:t>lograr el resultado deseado—, se adoptó la lista **estándar de la</w:t>
+      </w:r>
+    </w:p>
+    <w:p>
+      <w:pPr>
+        <w:pStyle w:val="Body"/>
+      </w:pPr>
+      <w:r>
+        <w:t>literatura** de hubs de reexportación: Países Bajos, Bélgica, Singapur,</w:t>
+      </w:r>
+    </w:p>
+    <w:p>
+      <w:pPr>
+        <w:pStyle w:val="Body"/>
+      </w:pPr>
+      <w:r>
+        <w:t>Hong Kong, Panamá y Emiratos Árabes Unidos (el eje</w:t>
+      </w:r>
+    </w:p>
+    <w:p>
+      <w:pPr>
+        <w:pStyle w:val="Body"/>
+      </w:pPr>
+      <w:r>
+        <w:t>Róterdam-Amberes-Singapur-Hong Kong-Panamá-Dubái). Esta lista se fija *a</w:t>
+      </w:r>
+    </w:p>
+    <w:p>
+      <w:pPr>
+        <w:pStyle w:val="Body"/>
+      </w:pPr>
+      <w:r>
+        <w:t>priori*, por la clasificación habitual en estudios de comercio y estadística</w:t>
+      </w:r>
+    </w:p>
+    <w:p>
+      <w:pPr>
+        <w:pStyle w:val="Body"/>
+      </w:pPr>
+      <w:r>
+        <w:t>oficial, no por los residuos de este dataset específico —una distinción</w:t>
+      </w:r>
+    </w:p>
+    <w:p>
+      <w:pPr>
+        <w:pStyle w:val="Body"/>
+      </w:pPr>
+      <w:r>
+        <w:t>metodológica central: el criterio de exclusión debe ser externo y</w:t>
+      </w:r>
+    </w:p>
+    <w:p>
+      <w:pPr>
+        <w:pStyle w:val="Body"/>
+      </w:pPr>
+      <w:r>
+        <w:t>verificable, nunca derivado circularmente del resultado que se quiere</w:t>
+      </w:r>
+    </w:p>
+    <w:p>
+      <w:pPr>
+        <w:pStyle w:val="Body"/>
+      </w:pPr>
+      <w:r>
+        <w:t>obtener.</w:t>
       </w:r>
     </w:p>
     <w:p>
@@ -4933,23 +5461,111 @@
         <w:pStyle w:val="Body"/>
       </w:pPr>
       <w:r>
-        <w:t>lejanas (sobre todo China), un patrón documentado en la literatura reciente</w:t>
-      </w:r>
-    </w:p>
-    <w:p>
-      <w:pPr>
-        <w:pStyle w:val="Body"/>
-      </w:pPr>
-      <w:r>
-        <w:t>de comercio de América Latina con Asia, y que domina sobre cualquier</w:t>
-      </w:r>
-    </w:p>
-    <w:p>
-      <w:pPr>
-        <w:pStyle w:val="Body"/>
-      </w:pPr>
-      <w:r>
-        <w:t>preferencia por proximidad geográfica.</w:t>
+        <w:t>lejanas, sobre todo China. Este patrón, lejos de ser una peculiaridad</w:t>
+      </w:r>
+    </w:p>
+    <w:p>
+      <w:pPr>
+        <w:pStyle w:val="Body"/>
+      </w:pPr>
+      <w:r>
+        <w:t>peruana, es consistente con la literatura sobre el ascenso de China como</w:t>
+      </w:r>
+    </w:p>
+    <w:p>
+      <w:pPr>
+        <w:pStyle w:val="Body"/>
+      </w:pPr>
+      <w:r>
+        <w:t>proveedor manufacturero global: Autor, Dorn y Hanson (2013) documentan, con</w:t>
+      </w:r>
+    </w:p>
+    <w:p>
+      <w:pPr>
+        <w:pStyle w:val="Body"/>
+      </w:pPr>
+      <w:r>
+        <w:t>datos de EE.UU., cómo la penetración de las importaciones chinas</w:t>
+      </w:r>
+    </w:p>
+    <w:p>
+      <w:pPr>
+        <w:pStyle w:val="Body"/>
+      </w:pPr>
+      <w:r>
+        <w:t>reconfiguró de forma duradera la geografía de la oferta manufacturera</w:t>
+      </w:r>
+    </w:p>
+    <w:p>
+      <w:pPr>
+        <w:pStyle w:val="Body"/>
+      </w:pPr>
+      <w:r>
+        <w:t>mundial con independencia de la distancia al comprador, un fenómeno que la</w:t>
+      </w:r>
+    </w:p>
+    <w:p>
+      <w:pPr>
+        <w:pStyle w:val="Body"/>
+      </w:pPr>
+      <w:r>
+        <w:t>literatura posterior extendió a economías en desarrollo integradas a</w:t>
+      </w:r>
+    </w:p>
+    <w:p>
+      <w:pPr>
+        <w:pStyle w:val="Body"/>
+      </w:pPr>
+      <w:r>
+        <w:t>cadenas de valor globales centradas en Asia. Para un modelo de gravedad</w:t>
+      </w:r>
+    </w:p>
+    <w:p>
+      <w:pPr>
+        <w:pStyle w:val="Body"/>
+      </w:pPr>
+      <w:r>
+        <w:t>clásico, construido sobre el supuesto de que la fricción de distancia</w:t>
+      </w:r>
+    </w:p>
+    <w:p>
+      <w:pPr>
+        <w:pStyle w:val="Body"/>
+      </w:pPr>
+      <w:r>
+        <w:t>encarece el comercio de forma monotónica, este es precisamente el tipo de</w:t>
+      </w:r>
+    </w:p>
+    <w:p>
+      <w:pPr>
+        <w:pStyle w:val="Body"/>
+      </w:pPr>
+      <w:r>
+        <w:t>reconfiguración estructural que el coeficiente de distancia no está</w:t>
+      </w:r>
+    </w:p>
+    <w:p>
+      <w:pPr>
+        <w:pStyle w:val="Body"/>
+      </w:pPr>
+      <w:r>
+        <w:t>diseñado para absorber: no hay fricción de transporte, por baja que fuera,</w:t>
+      </w:r>
+    </w:p>
+    <w:p>
+      <w:pPr>
+        <w:pStyle w:val="Body"/>
+      </w:pPr>
+      <w:r>
+        <w:t>capaz de compensar la ventaja de escala, costo y especialización de las</w:t>
+      </w:r>
+    </w:p>
+    <w:p>
+      <w:pPr>
+        <w:pStyle w:val="Body"/>
+      </w:pPr>
+      <w:r>
+        <w:t>cadenas de suministro asiáticas en bienes manufacturados estandarizados.</w:t>
       </w:r>
     </w:p>
     <w:p>
@@ -5331,223 +5947,367 @@
         <w:pStyle w:val="Body"/>
       </w:pPr>
       <w:r>
-        <w:t>El hallazgo metodológico central es que, para una economía exportadora de</w:t>
-      </w:r>
-    </w:p>
-    <w:p>
-      <w:pPr>
-        <w:pStyle w:val="Body"/>
-      </w:pPr>
-      <w:r>
-        <w:t>commodities como Perú, un modelo de gravedad "de manual" sobre el valor</w:t>
-      </w:r>
-    </w:p>
-    <w:p>
-      <w:pPr>
-        <w:pStyle w:val="Body"/>
-      </w:pPr>
-      <w:r>
-        <w:t>total exportado no mide lo que se cree que mide: una fracción sustancial del</w:t>
-      </w:r>
-    </w:p>
-    <w:p>
-      <w:pPr>
-        <w:pStyle w:val="Body"/>
-      </w:pPr>
-      <w:r>
-        <w:t>flujo refleja la geografía de la refinación y el tránsito global de</w:t>
-      </w:r>
-    </w:p>
-    <w:p>
-      <w:pPr>
-        <w:pStyle w:val="Body"/>
-      </w:pPr>
-      <w:r>
-        <w:t>materias primas (Suiza para oro, Namibia para concentrados de cobre, Países</w:t>
-      </w:r>
-    </w:p>
-    <w:p>
-      <w:pPr>
-        <w:pStyle w:val="Body"/>
-      </w:pPr>
-      <w:r>
-        <w:t>Bajos/Panamá como puertos de redistribución), no la relación bilateral</w:t>
-      </w:r>
-    </w:p>
-    <w:p>
-      <w:pPr>
-        <w:pStyle w:val="Body"/>
-      </w:pPr>
-      <w:r>
-        <w:t>económica entre Perú y el país de destino final. Ignorar esto no solo</w:t>
-      </w:r>
-    </w:p>
-    <w:p>
-      <w:pPr>
-        <w:pStyle w:val="Body"/>
-      </w:pPr>
-      <w:r>
-        <w:t>distorsiona el coeficiente de distancia: también infla artificialmente el</w:t>
-      </w:r>
-    </w:p>
-    <w:p>
-      <w:pPr>
-        <w:pStyle w:val="Body"/>
-      </w:pPr>
-      <w:r>
-        <w:t>coeficiente de "tiene acuerdo comercial" (de +0.71 significativo a −0.05</w:t>
-      </w:r>
-    </w:p>
-    <w:p>
-      <w:pPr>
-        <w:pStyle w:val="Body"/>
-      </w:pPr>
-      <w:r>
-        <w:t>estadísticamente nulo), porque los países con acuerdos comerciales vigentes</w:t>
-      </w:r>
-    </w:p>
-    <w:p>
-      <w:pPr>
-        <w:pStyle w:val="Body"/>
-      </w:pPr>
-      <w:r>
-        <w:t>con Perú tienden a coincidir con los grandes compradores de oro y gas.</w:t>
-      </w:r>
-    </w:p>
-    <w:p>
-      <w:pPr>
-        <w:pStyle w:val="Body"/>
-      </w:pPr>
-      <w:r>
-        <w:t>La sección 5 muestra, además, que el mismo diagnóstico aplicado con el mismo</w:t>
-      </w:r>
-    </w:p>
-    <w:p>
-      <w:pPr>
-        <w:pStyle w:val="Body"/>
-      </w:pPr>
-      <w:r>
-        <w:t>rigor a las importaciones no produce el mismo resultado — y eso es, en sí</w:t>
-      </w:r>
-    </w:p>
-    <w:p>
-      <w:pPr>
-        <w:pStyle w:val="Body"/>
-      </w:pPr>
-      <w:r>
-        <w:t>mismo, la evidencia de que el procedimiento no está sesgado hacia "encontrar"</w:t>
-      </w:r>
-    </w:p>
-    <w:p>
-      <w:pPr>
-        <w:pStyle w:val="Body"/>
-      </w:pPr>
-      <w:r>
-        <w:t>el signo esperado: si lo estuviera, se habría seguido ajustando el filtro de</w:t>
-      </w:r>
-    </w:p>
-    <w:p>
-      <w:pPr>
-        <w:pStyle w:val="Body"/>
-      </w:pPr>
-      <w:r>
-        <w:t>importaciones hasta forzar un coeficiente de distancia negativo. No se hizo,</w:t>
-      </w:r>
-    </w:p>
-    <w:p>
-      <w:pPr>
-        <w:pStyle w:val="Body"/>
-      </w:pPr>
-      <w:r>
-        <w:t>porque los residuos no señalan a ningún hub de tránsito, y la explicación</w:t>
-      </w:r>
-    </w:p>
-    <w:p>
-      <w:pPr>
-        <w:pStyle w:val="Body"/>
-      </w:pPr>
-      <w:r>
-        <w:t>alternativa (concentración real en manufactura asiática) es más simple y</w:t>
-      </w:r>
-    </w:p>
-    <w:p>
-      <w:pPr>
-        <w:pStyle w:val="Body"/>
-      </w:pPr>
-      <w:r>
-        <w:t>mejor documentada que inventar una corrección adicional.</w:t>
-      </w:r>
-    </w:p>
-    <w:p>
-      <w:pPr>
-        <w:pStyle w:val="Body"/>
-      </w:pPr>
-      <w:r>
-        <w:t>Este patrón no es exclusivo de Perú: es un problema conocido en la</w:t>
-      </w:r>
-    </w:p>
-    <w:p>
-      <w:pPr>
-        <w:pStyle w:val="Body"/>
-      </w:pPr>
-      <w:r>
-        <w:t>literatura de gravedad para economías exportadoras de recursos naturales</w:t>
-      </w:r>
-    </w:p>
-    <w:p>
-      <w:pPr>
-        <w:pStyle w:val="Body"/>
-      </w:pPr>
-      <w:r>
-        <w:t>(Chile con cobre, los países del Golfo con petróleo, la República Democrática</w:t>
-      </w:r>
-    </w:p>
-    <w:p>
-      <w:pPr>
-        <w:pStyle w:val="Body"/>
-      </w:pPr>
-      <w:r>
-        <w:t>del Congo con cobalto). El aporte de este ejercicio es documentar el</w:t>
-      </w:r>
-    </w:p>
-    <w:p>
-      <w:pPr>
-        <w:pStyle w:val="Body"/>
-      </w:pPr>
-      <w:r>
-        <w:t>procedimiento completo y reproducible —diagnóstico de residuos, filtro por</w:t>
-      </w:r>
-    </w:p>
-    <w:p>
-      <w:pPr>
-        <w:pStyle w:val="Body"/>
-      </w:pPr>
-      <w:r>
-        <w:t>producto declarado a priori, filtro por país con lista estándar de la</w:t>
-      </w:r>
-    </w:p>
-    <w:p>
-      <w:pPr>
-        <w:pStyle w:val="Body"/>
-      </w:pPr>
-      <w:r>
-        <w:t>literatura, el punto explícito en el que se decide dejar de excluir</w:t>
-      </w:r>
-    </w:p>
-    <w:p>
-      <w:pPr>
-        <w:pStyle w:val="Body"/>
-      </w:pPr>
-      <w:r>
-        <w:t>observaciones, y la verificación simétrica del lado importador— en un caso</w:t>
-      </w:r>
-    </w:p>
-    <w:p>
-      <w:pPr>
-        <w:pStyle w:val="Body"/>
-      </w:pPr>
-      <w:r>
-        <w:t>real con datos públicos verificables.</w:t>
+        <w:t>El hallazgo central tiene una lectura econométrica y una lectura de</w:t>
+      </w:r>
+    </w:p>
+    <w:p>
+      <w:pPr>
+        <w:pStyle w:val="Body"/>
+      </w:pPr>
+      <w:r>
+        <w:t>economía real, y conviene separarlas. Desde la econometría: para una</w:t>
+      </w:r>
+    </w:p>
+    <w:p>
+      <w:pPr>
+        <w:pStyle w:val="Body"/>
+      </w:pPr>
+      <w:r>
+        <w:t>economía exportadora de commodities como Perú, un modelo de gravedad "de</w:t>
+      </w:r>
+    </w:p>
+    <w:p>
+      <w:pPr>
+        <w:pStyle w:val="Body"/>
+      </w:pPr>
+      <w:r>
+        <w:t>manual" estimado sobre el valor total exportado no mide lo que se asume que</w:t>
+      </w:r>
+    </w:p>
+    <w:p>
+      <w:pPr>
+        <w:pStyle w:val="Body"/>
+      </w:pPr>
+      <w:r>
+        <w:t>mide. Una fracción sustancial del flujo registrado refleja la geografía de</w:t>
+      </w:r>
+    </w:p>
+    <w:p>
+      <w:pPr>
+        <w:pStyle w:val="Body"/>
+      </w:pPr>
+      <w:r>
+        <w:t>la refinación y el tránsito global de materias primas —Suiza para oro,</w:t>
+      </w:r>
+    </w:p>
+    <w:p>
+      <w:pPr>
+        <w:pStyle w:val="Body"/>
+      </w:pPr>
+      <w:r>
+        <w:t>Namibia para concentrados de cobre, Países Bajos y Panamá como puertos de</w:t>
+      </w:r>
+    </w:p>
+    <w:p>
+      <w:pPr>
+        <w:pStyle w:val="Body"/>
+      </w:pPr>
+      <w:r>
+        <w:t>redistribución— y no la relación bilateral económica entre Perú y el país</w:t>
+      </w:r>
+    </w:p>
+    <w:p>
+      <w:pPr>
+        <w:pStyle w:val="Body"/>
+      </w:pPr>
+      <w:r>
+        <w:t>de destino final del bien. Ignorar esta distinción no solo distorsiona el</w:t>
+      </w:r>
+    </w:p>
+    <w:p>
+      <w:pPr>
+        <w:pStyle w:val="Body"/>
+      </w:pPr>
+      <w:r>
+        <w:t>coeficiente de distancia: también infla artificialmente el coeficiente de</w:t>
+      </w:r>
+    </w:p>
+    <w:p>
+      <w:pPr>
+        <w:pStyle w:val="Body"/>
+      </w:pPr>
+      <w:r>
+        <w:t>"tiene acuerdo comercial" (de +0.71 significativo a −0.05 estadísticamente</w:t>
+      </w:r>
+    </w:p>
+    <w:p>
+      <w:pPr>
+        <w:pStyle w:val="Body"/>
+      </w:pPr>
+      <w:r>
+        <w:t>nulo una vez depurados los commodities), porque los países con acuerdos</w:t>
+      </w:r>
+    </w:p>
+    <w:p>
+      <w:pPr>
+        <w:pStyle w:val="Body"/>
+      </w:pPr>
+      <w:r>
+        <w:t>comerciales vigentes con Perú tienden a coincidir, por azar institucional</w:t>
+      </w:r>
+    </w:p>
+    <w:p>
+      <w:pPr>
+        <w:pStyle w:val="Body"/>
+      </w:pPr>
+      <w:r>
+        <w:t>más que por diseño, con los grandes compradores de oro y gas. Un lector</w:t>
+      </w:r>
+    </w:p>
+    <w:p>
+      <w:pPr>
+        <w:pStyle w:val="Body"/>
+      </w:pPr>
+      <w:r>
+        <w:t>apresurado de la especificación cruda concluiría que los tratados de libre</w:t>
+      </w:r>
+    </w:p>
+    <w:p>
+      <w:pPr>
+        <w:pStyle w:val="Body"/>
+      </w:pPr>
+      <w:r>
+        <w:t>comercio de Perú tienen un efecto grande y significativo sobre sus</w:t>
+      </w:r>
+    </w:p>
+    <w:p>
+      <w:pPr>
+        <w:pStyle w:val="Body"/>
+      </w:pPr>
+      <w:r>
+        <w:t>exportaciones; la especificación depurada muestra que esa conclusión no</w:t>
+      </w:r>
+    </w:p>
+    <w:p>
+      <w:pPr>
+        <w:pStyle w:val="Body"/>
+      </w:pPr>
+      <w:r>
+        <w:t>sobrevive al control de la composición sectorial del comercio.</w:t>
+      </w:r>
+    </w:p>
+    <w:p>
+      <w:pPr>
+        <w:pStyle w:val="Body"/>
+      </w:pPr>
+      <w:r>
+        <w:t>Desde la economía real: la sección 5 muestra que el mismo diagnóstico,</w:t>
+      </w:r>
+    </w:p>
+    <w:p>
+      <w:pPr>
+        <w:pStyle w:val="Body"/>
+      </w:pPr>
+      <w:r>
+        <w:t>aplicado con el mismo rigor a las importaciones, no reproduce el resultado</w:t>
+      </w:r>
+    </w:p>
+    <w:p>
+      <w:pPr>
+        <w:pStyle w:val="Body"/>
+      </w:pPr>
+      <w:r>
+        <w:t>de las exportaciones —y esa asimetría es, en sí misma, la evidencia más</w:t>
+      </w:r>
+    </w:p>
+    <w:p>
+      <w:pPr>
+        <w:pStyle w:val="Body"/>
+      </w:pPr>
+      <w:r>
+        <w:t>convincente de que el procedimiento no estuvo sesgado hacia "encontrar" el</w:t>
+      </w:r>
+    </w:p>
+    <w:p>
+      <w:pPr>
+        <w:pStyle w:val="Body"/>
+      </w:pPr>
+      <w:r>
+        <w:t>signo que la teoría predice. Si el objetivo hubiera sido forzar un</w:t>
+      </w:r>
+    </w:p>
+    <w:p>
+      <w:pPr>
+        <w:pStyle w:val="Body"/>
+      </w:pPr>
+      <w:r>
+        <w:t>coeficiente de distancia negativo a cualquier costo, el camino disponible</w:t>
+      </w:r>
+    </w:p>
+    <w:p>
+      <w:pPr>
+        <w:pStyle w:val="Body"/>
+      </w:pPr>
+      <w:r>
+        <w:t>era evidente: seguir excluyendo países hasta que los residuos cedieran. No</w:t>
+      </w:r>
+    </w:p>
+    <w:p>
+      <w:pPr>
+        <w:pStyle w:val="Body"/>
+      </w:pPr>
+      <w:r>
+        <w:t>se hizo, porque los residuos del lado importador no señalan a ningún hub de</w:t>
+      </w:r>
+    </w:p>
+    <w:p>
+      <w:pPr>
+        <w:pStyle w:val="Body"/>
+      </w:pPr>
+      <w:r>
+        <w:t>tránsito conocido, y la explicación alternativa —concentración real de las</w:t>
+      </w:r>
+    </w:p>
+    <w:p>
+      <w:pPr>
+        <w:pStyle w:val="Body"/>
+      </w:pPr>
+      <w:r>
+        <w:t>importaciones peruanas en un puñado de potencias manufactureras asiáticas—</w:t>
+      </w:r>
+    </w:p>
+    <w:p>
+      <w:pPr>
+        <w:pStyle w:val="Body"/>
+      </w:pPr>
+      <w:r>
+        <w:t>es a la vez más simple y mejor documentada en la literatura de comercio</w:t>
+      </w:r>
+    </w:p>
+    <w:p>
+      <w:pPr>
+        <w:pStyle w:val="Body"/>
+      </w:pPr>
+      <w:r>
+        <w:t>internacional (Autor, Dorn y Hanson, 2013) que cualquier corrección</w:t>
+      </w:r>
+    </w:p>
+    <w:p>
+      <w:pPr>
+        <w:pStyle w:val="Body"/>
+      </w:pPr>
+      <w:r>
+        <w:t>adicional ad hoc.</w:t>
+      </w:r>
+    </w:p>
+    <w:p>
+      <w:pPr>
+        <w:pStyle w:val="Body"/>
+      </w:pPr>
+      <w:r>
+        <w:t>Este patrón de contaminación por commodities no es exclusivo de Perú: es un</w:t>
+      </w:r>
+    </w:p>
+    <w:p>
+      <w:pPr>
+        <w:pStyle w:val="Body"/>
+      </w:pPr>
+      <w:r>
+        <w:t>problema conocido en la literatura de gravedad aplicada a economías</w:t>
+      </w:r>
+    </w:p>
+    <w:p>
+      <w:pPr>
+        <w:pStyle w:val="Body"/>
+      </w:pPr>
+      <w:r>
+        <w:t>exportadoras de recursos naturales (Chile con cobre, los países del Golfo</w:t>
+      </w:r>
+    </w:p>
+    <w:p>
+      <w:pPr>
+        <w:pStyle w:val="Body"/>
+      </w:pPr>
+      <w:r>
+        <w:t>con petróleo, la República Democrática del Congo con cobalto), aunque rara</w:t>
+      </w:r>
+    </w:p>
+    <w:p>
+      <w:pPr>
+        <w:pStyle w:val="Body"/>
+      </w:pPr>
+      <w:r>
+        <w:t>vez se documenta con el nivel de detalle a nivel de producto (HS6) y de</w:t>
+      </w:r>
+    </w:p>
+    <w:p>
+      <w:pPr>
+        <w:pStyle w:val="Body"/>
+      </w:pPr>
+      <w:r>
+        <w:t>verificación de residuos que se presenta aquí. El aporte de este ejercicio</w:t>
+      </w:r>
+    </w:p>
+    <w:p>
+      <w:pPr>
+        <w:pStyle w:val="Body"/>
+      </w:pPr>
+      <w:r>
+        <w:t>es, en ese sentido, menos un hallazgo sustantivo nuevo sobre el comercio</w:t>
+      </w:r>
+    </w:p>
+    <w:p>
+      <w:pPr>
+        <w:pStyle w:val="Body"/>
+      </w:pPr>
+      <w:r>
+        <w:t>peruano que una demostración reproducible de procedimiento: diagnóstico de</w:t>
+      </w:r>
+    </w:p>
+    <w:p>
+      <w:pPr>
+        <w:pStyle w:val="Body"/>
+      </w:pPr>
+      <w:r>
+        <w:t>residuos antes de aceptar un coeficiente, filtro por producto declarado a</w:t>
+      </w:r>
+    </w:p>
+    <w:p>
+      <w:pPr>
+        <w:pStyle w:val="Body"/>
+      </w:pPr>
+      <w:r>
+        <w:t>priori y aplicado de forma pareja, filtro por país con una lista estándar</w:t>
+      </w:r>
+    </w:p>
+    <w:p>
+      <w:pPr>
+        <w:pStyle w:val="Body"/>
+      </w:pPr>
+      <w:r>
+        <w:t>de la literatura (no ajustada al resultado), un punto explícito en el que</w:t>
+      </w:r>
+    </w:p>
+    <w:p>
+      <w:pPr>
+        <w:pStyle w:val="Body"/>
+      </w:pPr>
+      <w:r>
+        <w:t>se decide dejar de excluir observaciones, y —el control que falta en la</w:t>
+      </w:r>
+    </w:p>
+    <w:p>
+      <w:pPr>
+        <w:pStyle w:val="Body"/>
+      </w:pPr>
+      <w:r>
+        <w:t>mayoría de ejercicios similares— la verificación simétrica del lado</w:t>
+      </w:r>
+    </w:p>
+    <w:p>
+      <w:pPr>
+        <w:pStyle w:val="Body"/>
+      </w:pPr>
+      <w:r>
+        <w:t>importador, que es precisamente lo que permite distinguir un artefacto de</w:t>
+      </w:r>
+    </w:p>
+    <w:p>
+      <w:pPr>
+        <w:pStyle w:val="Body"/>
+      </w:pPr>
+      <w:r>
+        <w:t>medición de un patrón económico real.</w:t>
       </w:r>
     </w:p>
     <w:p>
@@ -5794,23 +6554,31 @@
         <w:ind w:left="480" w:hanging="280"/>
       </w:pPr>
       <w:r>
-        <w:t>-  Santos Silva, J. M. C., &amp; Tenreyro, S. (2006). The Log of Gravity. *Review</w:t>
-      </w:r>
-    </w:p>
-    <w:p>
-      <w:pPr>
-        <w:pStyle w:val="Body"/>
-      </w:pPr>
-      <w:r>
-        <w:t>of Economics and Statistics*, 88(4), 641-658.</w:t>
-      </w:r>
-    </w:p>
-    <w:p>
-      <w:pPr>
-        <w:pStyle w:val="Body"/>
-      </w:pPr>
-      <w:r>
-        <w:t>DOI: 10.1162/rest.88.4.641</w:t>
+        <w:t>-  Autor, D. H., Dorn, D., &amp; Hanson, G. H. (2013). The China Syndrome: Local</w:t>
+      </w:r>
+    </w:p>
+    <w:p>
+      <w:pPr>
+        <w:pStyle w:val="Body"/>
+      </w:pPr>
+      <w:r>
+        <w:t>Labor Market Effects of Import Competition in the United States.</w:t>
+      </w:r>
+    </w:p>
+    <w:p>
+      <w:pPr>
+        <w:pStyle w:val="Body"/>
+      </w:pPr>
+      <w:r>
+        <w:t>American Economic Review, 103(6), 2121-2168.</w:t>
+      </w:r>
+    </w:p>
+    <w:p>
+      <w:pPr>
+        <w:pStyle w:val="Body"/>
+      </w:pPr>
+      <w:r>
+        <w:t>DOI: 10.1257/aer.103.6.2121</w:t>
       </w:r>
     </w:p>
     <w:p>
@@ -5819,15 +6587,23 @@
         <w:ind w:left="480" w:hanging="280"/>
       </w:pPr>
       <w:r>
-        <w:t>-  Tinbergen, J. (1962). *Shaping the World Economy: Suggestions for an</w:t>
-      </w:r>
-    </w:p>
-    <w:p>
-      <w:pPr>
-        <w:pStyle w:val="Body"/>
-      </w:pPr>
-      <w:r>
-        <w:t>International Economic Policy*. Twentieth Century Fund, Nueva York, 330 pp.</w:t>
+        <w:t>-  Santos Silva, J. M. C., &amp; Tenreyro, S. (2006). The Log of Gravity. *Review</w:t>
+      </w:r>
+    </w:p>
+    <w:p>
+      <w:pPr>
+        <w:pStyle w:val="Body"/>
+      </w:pPr>
+      <w:r>
+        <w:t>of Economics and Statistics*, 88(4), 641-658.</w:t>
+      </w:r>
+    </w:p>
+    <w:p>
+      <w:pPr>
+        <w:pStyle w:val="Body"/>
+      </w:pPr>
+      <w:r>
+        <w:t>DOI: 10.1162/rest.88.4.641</w:t>
       </w:r>
     </w:p>
     <w:p>
@@ -5836,23 +6612,15 @@
         <w:ind w:left="480" w:hanging="280"/>
       </w:pPr>
       <w:r>
-        <w:t>-  Head, K., &amp; Mayer, T. (2014). Gravity Equations: Workhorse, Toolkit, and</w:t>
-      </w:r>
-    </w:p>
-    <w:p>
-      <w:pPr>
-        <w:pStyle w:val="Body"/>
-      </w:pPr>
-      <w:r>
-        <w:t>Cookbook. En Handbook of International Economics, Vol. 4, pp. 131-195.</w:t>
-      </w:r>
-    </w:p>
-    <w:p>
-      <w:pPr>
-        <w:pStyle w:val="Body"/>
-      </w:pPr>
-      <w:r>
-        <w:t>Elsevier. DOI: 10.1016/B978-0-444-54314-1.00003-3</w:t>
+        <w:t>-  Tinbergen, J. (1962). *Shaping the World Economy: Suggestions for an</w:t>
+      </w:r>
+    </w:p>
+    <w:p>
+      <w:pPr>
+        <w:pStyle w:val="Body"/>
+      </w:pPr>
+      <w:r>
+        <w:t>International Economic Policy*. Twentieth Century Fund, Nueva York, 330 pp.</w:t>
       </w:r>
     </w:p>
     <w:p>
@@ -5861,23 +6629,23 @@
         <w:ind w:left="480" w:hanging="280"/>
       </w:pPr>
       <w:r>
-        <w:t>-  CEPII BACI (vintage 202601), CEPII GeoDist, CEPII Gravity V202211 — centre</w:t>
-      </w:r>
-    </w:p>
-    <w:p>
-      <w:pPr>
-        <w:pStyle w:val="Body"/>
-      </w:pPr>
-      <w:r>
-        <w:t>d'Études Prospectives et d'Informations Internationales.</w:t>
-      </w:r>
-    </w:p>
-    <w:p>
-      <w:pPr>
-        <w:pStyle w:val="Body"/>
-      </w:pPr>
-      <w:r>
-        <w:t>cepii.fr</w:t>
+        <w:t>-  Head, K., &amp; Mayer, T. (2014). Gravity Equations: Workhorse, Toolkit, and</w:t>
+      </w:r>
+    </w:p>
+    <w:p>
+      <w:pPr>
+        <w:pStyle w:val="Body"/>
+      </w:pPr>
+      <w:r>
+        <w:t>Cookbook. En Handbook of International Economics, Vol. 4, pp. 131-195.</w:t>
+      </w:r>
+    </w:p>
+    <w:p>
+      <w:pPr>
+        <w:pStyle w:val="Body"/>
+      </w:pPr>
+      <w:r>
+        <w:t>Elsevier. DOI: 10.1016/B978-0-444-54314-1.00003-3</w:t>
       </w:r>
     </w:p>
     <w:p>
@@ -5886,6 +6654,89 @@
         <w:ind w:left="480" w:hanging="280"/>
       </w:pPr>
       <w:r>
+        <w:t>-  UNCTAD. Review of Maritime Transport y estadísticas de reexportación:</w:t>
+      </w:r>
+    </w:p>
+    <w:p>
+      <w:pPr>
+        <w:pStyle w:val="Body"/>
+      </w:pPr>
+      <w:r>
+        <w:t>las reexportaciones superan el 40% de las exportaciones totales de Hong</w:t>
+      </w:r>
+    </w:p>
+    <w:p>
+      <w:pPr>
+        <w:pStyle w:val="Body"/>
+      </w:pPr>
+      <w:r>
+        <w:t>Kong, Singapur, Países Bajos y Chipre.</w:t>
+      </w:r>
+    </w:p>
+    <w:p>
+      <w:pPr>
+        <w:pStyle w:val="Bullet"/>
+        <w:ind w:left="480" w:hanging="280"/>
+      </w:pPr>
+      <w:r>
+        <w:t>-  swissinfo.ch (2025). US tariff negotiations reaffirm Switzerland's role</w:t>
+      </w:r>
+    </w:p>
+    <w:p>
+      <w:pPr>
+        <w:pStyle w:val="Body"/>
+      </w:pPr>
+      <w:r>
+        <w:t>as a gold hub (cita cifra del Secretariado de Estado de Economía suizo,</w:t>
+      </w:r>
+    </w:p>
+    <w:p>
+      <w:pPr>
+        <w:pStyle w:val="Body"/>
+      </w:pPr>
+      <w:r>
+        <w:t>SECO: 34% del oro refinado mundial en 2023).</w:t>
+      </w:r>
+    </w:p>
+    <w:p>
+      <w:pPr>
+        <w:pStyle w:val="Body"/>
+      </w:pPr>
+      <w:r>
+        <w:t>swissinfo.ch/eng/business/switzerland-the-world-s-gold-hub/33706126</w:t>
+      </w:r>
+    </w:p>
+    <w:p>
+      <w:pPr>
+        <w:pStyle w:val="Bullet"/>
+        <w:ind w:left="480" w:hanging="280"/>
+      </w:pPr>
+      <w:r>
+        <w:t>-  CEPII BACI (vintage 202601), CEPII GeoDist, CEPII Gravity V202211 — centre</w:t>
+      </w:r>
+    </w:p>
+    <w:p>
+      <w:pPr>
+        <w:pStyle w:val="Body"/>
+      </w:pPr>
+      <w:r>
+        <w:t>d'Études Prospectives et d'Informations Internationales.</w:t>
+      </w:r>
+    </w:p>
+    <w:p>
+      <w:pPr>
+        <w:pStyle w:val="Body"/>
+      </w:pPr>
+      <w:r>
+        <w:t>cepii.fr</w:t>
+      </w:r>
+    </w:p>
+    <w:p>
+      <w:pPr>
+        <w:pStyle w:val="Bullet"/>
+        <w:ind w:left="480" w:hanging="280"/>
+      </w:pPr>
+      <w:r>
         <w:t>-  World Bank, World Development Indicators, NY.GDP.MKTP.CD (PBI corriente,</w:t>
       </w:r>
     </w:p>
@@ -5902,23 +6753,47 @@
         <w:pStyle w:val="Body"/>
       </w:pPr>
       <w:r>
-        <w:t>Las 4 referencias académicas fueron verificadas en vivo contra fuentes</w:t>
-      </w:r>
-    </w:p>
-    <w:p>
-      <w:pPr>
-        <w:pStyle w:val="Body"/>
-      </w:pPr>
-      <w:r>
-        <w:t>primarias el 2026-10-18 (ver referencias_verificadas.md en la raíz de este</w:t>
-      </w:r>
-    </w:p>
-    <w:p>
-      <w:pPr>
-        <w:pStyle w:val="Body"/>
-      </w:pPr>
-      <w:r>
-        <w:t>proyecto para el detalle de la verificación).</w:t>
+        <w:t>Las 7 referencias con afirmaciones verificables (4 académicas + 3 fuentes de</w:t>
+      </w:r>
+    </w:p>
+    <w:p>
+      <w:pPr>
+        <w:pStyle w:val="Body"/>
+      </w:pPr>
+      <w:r>
+        <w:t>estadística institucional) fueron verificadas en vivo contra fuentes</w:t>
+      </w:r>
+    </w:p>
+    <w:p>
+      <w:pPr>
+        <w:pStyle w:val="Body"/>
+      </w:pPr>
+      <w:r>
+        <w:t>primarias el 2026-10-18 (ver referencias_verificadas.md en la raíz de</w:t>
+      </w:r>
+    </w:p>
+    <w:p>
+      <w:pPr>
+        <w:pStyle w:val="Body"/>
+      </w:pPr>
+      <w:r>
+        <w:t>este proyecto para el detalle de la verificación de las 4 académicas; las</w:t>
+      </w:r>
+    </w:p>
+    <w:p>
+      <w:pPr>
+        <w:pStyle w:val="Body"/>
+      </w:pPr>
+      <w:r>
+        <w:t>3 adicionales se verificaron en la misma sesión de trabajo que incorporó</w:t>
+      </w:r>
+    </w:p>
+    <w:p>
+      <w:pPr>
+        <w:pStyle w:val="Body"/>
+      </w:pPr>
+      <w:r>
+        <w:t>esta revisión narrativa).</w:t>
       </w:r>
     </w:p>
     <w:p>

</xml_diff>